<commit_message>
Home Service audit: missed-call questions and percentage scoring
</commit_message>
<xml_diff>
--- a/netlify/functions/templates/HS_Attract_Convert_90-Day_Action_Plan.docx
+++ b/netlify/functions/templates/HS_Attract_Convert_90-Day_Action_Plan.docx
@@ -583,6 +583,23 @@
         <w:rPr>
           <w:b/>
         </w:rPr>
+        <w:t xml:space="preserve">[MISSED_CALL_LABEL]</w:t>
+      </w:r>
+    </w:p>
+    <w:p>
+      <w:pPr/>
+      <w:r>
+        <w:t xml:space="preserve">[MISSED_CALL_NOTE]</w:t>
+      </w:r>
+    </w:p>
+    <w:p>
+      <w:pPr>
+        <w:spacing w:after="40"/>
+      </w:pPr>
+      <w:r>
+        <w:rPr>
+          <w:b/>
+        </w:rPr>
         <w:t xml:space="preserve">In your words</w:t>
       </w:r>
     </w:p>
@@ -682,7 +699,7 @@
         <w:pStyle w:val="SmallNote"/>
       </w:pPr>
       <w:r>
-        <w:t xml:space="preserve">Short on time? Use your Start Here page and tracking sheet instead. They are the short version of this week: a smaller list, a ready-made message, and a Day 14 checkpoint.</w:t>
+        <w:t xml:space="preserve">Short on time? Use your Start Here guide and tracking sheet instead. They are the short version of this week: a smaller list, ready-made messages, and a Day 14 checkpoint.</w:t>
       </w:r>
     </w:p>
     <w:p>
@@ -1063,7 +1080,7 @@
         <w:pStyle w:val="ListBullet"/>
       </w:pPr>
       <w:r>
-        <w:t xml:space="preserve">Day 14: Final active follow-up before moving the lead or open estimate to a seasonal follow-up list, if appropriate.</w:t>
+        <w:t xml:space="preserve">Day 14: Final active follow-up before moving the lead to a seasonal follow-up list, if appropriate.</w:t>
       </w:r>
     </w:p>
     <w:p>
@@ -1071,7 +1088,7 @@
         <w:pStyle w:val="SmallNote"/>
       </w:pPr>
       <w:r>
-        <w:t>The exact timing should be adjusted to your business, but every new lead should follow one written standard instead of relying on memory.</w:t>
+        <w:t xml:space="preserve">Open estimates use a gentler schedule: send it on Day 0, then follow up on Day 2, Day 7, and Day 14. A new lead needs speed; a customer reviewing an estimate needs time to decide. Adjust the timing to your business, but write it down instead of relying on memory.</w:t>
       </w:r>
     </w:p>
     <w:p>

</xml_diff>